<commit_message>
Fix blank page in Word payment request template
</commit_message>
<xml_diff>
--- a/quanly/document_templates/thanh_toan_cong_can_thiep/Mau_DNTT.docx
+++ b/quanly/document_templates/thanh_toan_cong_can_thiep/Mau_DNTT.docx
@@ -1434,10 +1434,21 @@
               <w:rPr>
                 <w:b/>
                 <w:bCs/>
-                <w:lang w:val="fr-FR"/>
-              </w:rPr>
-            </w:pPr>
-          </w:p>
+              </w:rPr>
+            </w:pPr>
+            <w:r>
+              <w:rPr>
+                <w:b/>
+                <w:bCs/>
+              </w:rPr>
+              <w:t>Lưu Tiến Kiên</w:t>
+            </w:r>
+          </w:p>
+        </w:tc>
+        <w:tc>
+          <w:tcPr>
+            <w:tcW w:w="3110" w:type="dxa"/>
+          </w:tcPr>
           <w:p>
             <w:pPr>
               <w:jc w:val="center"/>
@@ -1451,14 +1462,9 @@
                 <w:b/>
                 <w:bCs/>
               </w:rPr>
-              <w:t>Lưu Tiến Kiên</w:t>
-            </w:r>
-          </w:p>
-        </w:tc>
-        <w:tc>
-          <w:tcPr>
-            <w:tcW w:w="3110" w:type="dxa"/>
-          </w:tcPr>
+              <w:t>Cán bộ điều phối tỉnh</w:t>
+            </w:r>
+          </w:p>
           <w:p>
             <w:pPr>
               <w:jc w:val="center"/>
@@ -1467,13 +1473,15 @@
                 <w:bCs/>
               </w:rPr>
             </w:pPr>
-            <w:r>
+          </w:p>
+          <w:p>
+            <w:pPr>
+              <w:jc w:val="center"/>
               <w:rPr>
                 <w:b/>
                 <w:bCs/>
               </w:rPr>
-              <w:t>Cán bộ điều phối tỉnh</w:t>
-            </w:r>
+            </w:pPr>
           </w:p>
           <w:p>
             <w:pPr>
@@ -1501,7 +1509,19 @@
                 <w:bCs/>
               </w:rPr>
             </w:pPr>
-          </w:p>
+            <w:r>
+              <w:rPr>
+                <w:b/>
+                <w:bCs/>
+              </w:rPr>
+              <w:t>Trần Ngọc Thảo</w:t>
+            </w:r>
+          </w:p>
+        </w:tc>
+        <w:tc>
+          <w:tcPr>
+            <w:tcW w:w="3190" w:type="dxa"/>
+          </w:tcPr>
           <w:p>
             <w:pPr>
               <w:jc w:val="center"/>
@@ -1510,61 +1530,13 @@
                 <w:bCs/>
               </w:rPr>
             </w:pPr>
-          </w:p>
-          <w:p>
-            <w:pPr>
-              <w:jc w:val="center"/>
+            <w:r>
               <w:rPr>
                 <w:b/>
                 <w:bCs/>
               </w:rPr>
-            </w:pPr>
-          </w:p>
-          <w:p>
-            <w:pPr>
-              <w:jc w:val="center"/>
-              <w:rPr>
-                <w:b/>
-                <w:bCs/>
-              </w:rPr>
-            </w:pPr>
-            <w:r>
-              <w:rPr>
-                <w:b/>
-                <w:bCs/>
-              </w:rPr>
-              <w:t>Trần Ngọc Thảo</w:t>
-            </w:r>
-          </w:p>
-        </w:tc>
-        <w:tc>
-          <w:tcPr>
-            <w:tcW w:w="3190" w:type="dxa"/>
-          </w:tcPr>
-          <w:p>
-            <w:pPr>
-              <w:jc w:val="center"/>
-              <w:rPr>
-                <w:b/>
-                <w:bCs/>
-              </w:rPr>
-            </w:pPr>
-            <w:r>
-              <w:rPr>
-                <w:b/>
-                <w:bCs/>
-              </w:rPr>
               <w:t>Người đề nghị</w:t>
             </w:r>
-          </w:p>
-          <w:p>
-            <w:pPr>
-              <w:jc w:val="center"/>
-              <w:rPr>
-                <w:b/>
-                <w:bCs/>
-              </w:rPr>
-            </w:pPr>
           </w:p>
           <w:p>
             <w:pPr>

</xml_diff>